<commit_message>
feat: verify lab database and update lab reports
</commit_message>
<xml_diff>
--- a/labs/Лабораторная_1.docx
+++ b/labs/Лабораторная_1.docx
@@ -803,7 +803,7 @@
     </w:p>
     <w:p>
       <w:r>
-        <w:t>На момент подготовки материалов в папке отсутствует Git-репозиторий. Добавлен .gitignore для node_modules, .env, журналов, файлов локальных БД и временных материалов. package-lock.json сохраняется в репозитории. После создания пустого удалённого репозитория необходимо выполнить:</w:t>
+        <w:t>Создан публичный репозиторий https://github.com/dd9272917/applied-is-project-2026. Локальная ветка main связана с origin/main; первый коммит 9e1f10e загружен на GitHub. Файл .gitignore исключает node_modules, .env, журналы и локальные файлы БД. package-lock.json сохранён в репозитории. Ниже приведены команды первоначальной настройки как справка; повторять их для уже связанного проекта не нужно.</w:t>
       </w:r>
     </w:p>
     <w:p>
@@ -871,11 +871,7 @@
         <w:spacing w:after="0"/>
       </w:pPr>
       <w:r>
-        <w:rPr>
-          <w:rFonts w:ascii="Consolas" w:hAnsi="Consolas"/>
-          <w:sz w:val="18"/>
-        </w:rPr>
-        <w:t>git remote add origin https://github.com/YOUR_LOGIN/applied-is-project-2026.git</w:t>
+        <w:t>git remote add origin https://github.com/dd9272917/applied-is-project-2026.git</w:t>
       </w:r>
     </w:p>
     <w:p>
@@ -938,7 +934,7 @@
     </w:p>
     <w:p>
       <w:r>
-        <w:t>Подготовлены описание системы, ER-схема, структура проекта и исключения Git. Для завершения работы необходимо вписать ФИО и группу, подтвердить настройку IDE, создать репозиторий и добавить скриншоты git status, страницы репозитория и запуска приложения. Публикация и настройка IDE в данном отчёте не заявляются выполненными.</w:t>
+        <w:t>Подготовлены описание системы, ER-схема и структура проекта. Создан локальный Git-репозиторий, выполнен первый коммит и публикация в публичный репозиторий dd9272917/applied-is-project-2026. README содержит ER-диаграмму. Перед сдачей вписать ФИО и группу и добавить собственные скриншоты репозитория и редактора с ИИ. Настройка конкретного расширения IDE отдельно не подтверждалась.</w:t>
       </w:r>
     </w:p>
     <w:sectPr>

</xml_diff>